<commit_message>
v0.3.0: richer schema introspection, safer validator, sampling, CI
Validator: fix false positives (common column names like 'comment' and
functions like REPLACE() are now allowed) while still blocking writes,
data-modifying CTEs, SELECT INTO, FOR UPDATE, and multi-statement input.
Allow EXPLAIN for read-only query-plan inspection.

db: describe_table now reports foreign keys, indexes, and comments (not
just columns + PK). Add get_table_sample. Clean, concise error messages
instead of driver stack traces. Best-effort per-dialect read-only session
and statement timeout (DB_QUERY_TIMEOUT). list_tables tags each entry
table/view.

Add get_table_sample tool. Extend the SQLite end-to-end test to cover
FKs/indexes/sample/EXPLAIN/clean errors and the validator fix. Add a
GitHub Actions CI matrix (Python 3.10-3.13). README badges + updated
tool docs. Regenerate the Word docs. Bump to 0.3.0.
</commit_message>
<xml_diff>
--- a/docs/CONFIGURATION.docx
+++ b/docs/CONFIGURATION.docx
@@ -262,15 +262,7 @@
           </w:tcPr>
           <w:p>
             <w:r>
-              <w:t xml:space="preserve">Used for the virtual environment and installs. </w:t>
-            </w:r>
-            <w:r>
-              <w:rPr>
-                <w:rFonts w:ascii="Consolas" w:cs="Consolas" w:eastAsia="Consolas" w:hAnsi="Consolas"/>
-                <w:sz w:val="20"/>
-                <w:szCs w:val="20"/>
-              </w:rPr>
-              <w:t xml:space="preserve">uv --version</w:t>
+              <w:t xml:space="preserve">Used for the virtual environment and installs.</w:t>
             </w:r>
           </w:p>
         </w:tc>
@@ -950,7 +942,7 @@
           </w:tcPr>
           <w:p>
             <w:r>
-              <w:t xml:space="preserve">Optional. Defaults per type: Oracle 1521, PostgreSQL 5432, MySQL 3306, SQL Server 1433.</w:t>
+              <w:t xml:space="preserve">Optional. Defaults: Oracle 1521, PostgreSQL 5432, MySQL 3306, SQL Server 1433.</w:t>
             </w:r>
           </w:p>
         </w:tc>
@@ -1451,6 +1443,79 @@
                 <w:sz w:val="20"/>
                 <w:szCs w:val="20"/>
               </w:rPr>
+              <w:t xml:space="preserve">DB_QUERY_TIMEOUT</w:t>
+            </w:r>
+          </w:p>
+        </w:tc>
+        <w:tc>
+          <w:tcPr>
+            <w:tcW w:type="dxa" w:w="1200"/>
+            <w:tcBorders>
+              <w:top w:val="single" w:color="CCCCCC" w:sz="1"/>
+              <w:left w:val="single" w:color="CCCCCC" w:sz="1"/>
+              <w:bottom w:val="single" w:color="CCCCCC" w:sz="1"/>
+              <w:right w:val="single" w:color="CCCCCC" w:sz="1"/>
+            </w:tcBorders>
+            <w:tcMar>
+              <w:top w:type="dxa" w:w="60"/>
+              <w:left w:type="dxa" w:w="120"/>
+              <w:bottom w:type="dxa" w:w="60"/>
+              <w:right w:type="dxa" w:w="120"/>
+            </w:tcMar>
+          </w:tcPr>
+          <w:p>
+            <w:r>
+              <w:t xml:space="preserve">30</w:t>
+            </w:r>
+          </w:p>
+        </w:tc>
+        <w:tc>
+          <w:tcPr>
+            <w:tcW w:type="dxa" w:w="5560"/>
+            <w:tcBorders>
+              <w:top w:val="single" w:color="CCCCCC" w:sz="1"/>
+              <w:left w:val="single" w:color="CCCCCC" w:sz="1"/>
+              <w:bottom w:val="single" w:color="CCCCCC" w:sz="1"/>
+              <w:right w:val="single" w:color="CCCCCC" w:sz="1"/>
+            </w:tcBorders>
+            <w:tcMar>
+              <w:top w:type="dxa" w:w="60"/>
+              <w:left w:type="dxa" w:w="120"/>
+              <w:bottom w:type="dxa" w:w="60"/>
+              <w:right w:type="dxa" w:w="120"/>
+            </w:tcMar>
+          </w:tcPr>
+          <w:p>
+            <w:r>
+              <w:t xml:space="preserve">Seconds. Best-effort statement timeout applied where the dialect supports it (PostgreSQL, MySQL, Oracle).</w:t>
+            </w:r>
+          </w:p>
+        </w:tc>
+      </w:tr>
+      <w:tr>
+        <w:tc>
+          <w:tcPr>
+            <w:tcW w:type="dxa" w:w="2600"/>
+            <w:tcBorders>
+              <w:top w:val="single" w:color="CCCCCC" w:sz="1"/>
+              <w:left w:val="single" w:color="CCCCCC" w:sz="1"/>
+              <w:bottom w:val="single" w:color="CCCCCC" w:sz="1"/>
+              <w:right w:val="single" w:color="CCCCCC" w:sz="1"/>
+            </w:tcBorders>
+            <w:tcMar>
+              <w:top w:type="dxa" w:w="60"/>
+              <w:left w:type="dxa" w:w="120"/>
+              <w:bottom w:type="dxa" w:w="60"/>
+              <w:right w:type="dxa" w:w="120"/>
+            </w:tcMar>
+          </w:tcPr>
+          <w:p>
+            <w:r>
+              <w:rPr>
+                <w:rFonts w:ascii="Consolas" w:cs="Consolas" w:eastAsia="Consolas" w:hAnsi="Consolas"/>
+                <w:sz w:val="20"/>
+                <w:szCs w:val="20"/>
+              </w:rPr>
               <w:t xml:space="preserve">DB_POOL_MIN</w:t>
             </w:r>
           </w:p>
@@ -1916,7 +1981,7 @@
           <w:sz w:val="20"/>
           <w:szCs w:val="20"/>
         </w:rPr>
-        <w:t xml:space="preserve">  -- "C:\path\to\database-mcp\.venv\Scripts\python.exe" -m database_mcp.server</w:t>
+        <w:t xml:space="preserve">  -- "...\.venv\Scripts\python.exe" -m database_mcp.server</w:t>
       </w:r>
     </w:p>
     <w:p>
@@ -1986,7 +2051,7 @@
           <w:sz w:val="20"/>
           <w:szCs w:val="20"/>
         </w:rPr>
-        <w:t xml:space="preserve">  -- "C:\path\to\database-mcp\.venv\Scripts\python.exe" -m database_mcp.server</w:t>
+        <w:t xml:space="preserve">  -- "...\.venv\Scripts\python.exe" -m database_mcp.server</w:t>
       </w:r>
     </w:p>
     <w:p>
@@ -2042,7 +2107,7 @@
           <w:sz w:val="20"/>
           <w:szCs w:val="20"/>
         </w:rPr>
-        <w:t xml:space="preserve">.venv\Scripts\python.exe sqlite_test.py    # live round-trip against a temp SQLite DB</w:t>
+        <w:t xml:space="preserve">.venv\Scripts\python.exe sqlite_test.py    # live round-trip: schema, FKs, sample, safety</w:t>
       </w:r>
     </w:p>
     <w:p>
@@ -2074,7 +2139,7 @@
         <w:t xml:space="preserve">“test the database connection”</w:t>
       </w:r>
       <w:r>
-        <w:t xml:space="preserve"> — this calls test_connection and returns the dialect and server version.</w:t>
+        <w:t xml:space="preserve"> — this returns the dialect and server version.</w:t>
       </w:r>
     </w:p>
     <w:p>
@@ -2455,7 +2520,7 @@
           </w:tcPr>
           <w:p>
             <w:r>
-              <w:t xml:space="preserve">SQL Server: data source name not found</w:t>
+              <w:t xml:space="preserve">Result has truncated: true</w:t>
             </w:r>
           </w:p>
         </w:tc>
@@ -2477,7 +2542,7 @@
           </w:tcPr>
           <w:p>
             <w:r>
-              <w:t xml:space="preserve">Install the Microsoft ODBC driver and set DB_ODBC_DRIVER to match.</w:t>
+              <w:t xml:space="preserve">The query hit DB_MAX_ROWS. Narrow with WHERE, or raise the ceiling (mind volume).</w:t>
             </w:r>
           </w:p>
         </w:tc>
@@ -2501,53 +2566,7 @@
           </w:tcPr>
           <w:p>
             <w:r>
-              <w:t xml:space="preserve">Result has truncated: true</w:t>
-            </w:r>
-          </w:p>
-        </w:tc>
-        <w:tc>
-          <w:tcPr>
-            <w:tcW w:type="dxa" w:w="5960"/>
-            <w:tcBorders>
-              <w:top w:val="single" w:color="CCCCCC" w:sz="1"/>
-              <w:left w:val="single" w:color="CCCCCC" w:sz="1"/>
-              <w:bottom w:val="single" w:color="CCCCCC" w:sz="1"/>
-              <w:right w:val="single" w:color="CCCCCC" w:sz="1"/>
-            </w:tcBorders>
-            <w:tcMar>
-              <w:top w:type="dxa" w:w="60"/>
-              <w:left w:type="dxa" w:w="120"/>
-              <w:bottom w:type="dxa" w:w="60"/>
-              <w:right w:type="dxa" w:w="120"/>
-            </w:tcMar>
-          </w:tcPr>
-          <w:p>
-            <w:r>
-              <w:t xml:space="preserve">The query hit DB_MAX_ROWS. Narrow with WHERE, or raise the ceiling (mind volume).</w:t>
-            </w:r>
-          </w:p>
-        </w:tc>
-      </w:tr>
-      <w:tr>
-        <w:tc>
-          <w:tcPr>
-            <w:tcW w:type="dxa" w:w="3400"/>
-            <w:tcBorders>
-              <w:top w:val="single" w:color="CCCCCC" w:sz="1"/>
-              <w:left w:val="single" w:color="CCCCCC" w:sz="1"/>
-              <w:bottom w:val="single" w:color="CCCCCC" w:sz="1"/>
-              <w:right w:val="single" w:color="CCCCCC" w:sz="1"/>
-            </w:tcBorders>
-            <w:tcMar>
-              <w:top w:type="dxa" w:w="60"/>
-              <w:left w:type="dxa" w:w="120"/>
-              <w:bottom w:type="dxa" w:w="60"/>
-              <w:right w:type="dxa" w:w="120"/>
-            </w:tcMar>
-          </w:tcPr>
-          <w:p>
-            <w:r>
-              <w:t xml:space="preserve">“Only SELECT / WITH queries are allowed”</w:t>
+              <w:t xml:space="preserve">“Only SELECT / WITH / EXPLAIN queries are allowed”</w:t>
             </w:r>
           </w:p>
         </w:tc>

</xml_diff>